<commit_message>
Clarify radio alternatives and payment sample pricing
</commit_message>
<xml_diff>
--- a/outputs/01a0d046-7d49-7871-8a87-73ebb2cf093f/Agentic_AI_UW_Component_Costs.docx
+++ b/outputs/01a0d046-7d49-7871-8a87-73ebb2cf093f/Agentic_AI_UW_Component_Costs.docx
@@ -2297,7 +2297,7 @@
                 <w:b w:val="0"/>
                 <w:sz w:val="20"/>
               </w:rPr>
-              <w:t>Calls and texts</w:t>
+              <w:t>Standalone calls</w:t>
             </w:r>
           </w:p>
         </w:tc>
@@ -2510,6 +2510,11 @@
     </w:p>
     <w:p>
       <w:r>
+        <w:t>The TDK microphone and DVP camera need interface validation. BLE does not provide Classic Bluetooth/A2DP. Payment provisioning, carrier service, support circuitry, and assembly are additional requirements; these tables are not a complete assembled-device quote.</w:t>
+      </w:r>
+    </w:p>
+    <w:p>
+      <w:r>
         <w:br w:type="page"/>
       </w:r>
     </w:p>
@@ -2523,7 +2528,7 @@
     </w:p>
     <w:p>
       <w:r>
-        <w:t>The Bluetooth module replaces the ESP32. Modules, physical parts, and a camera assembly are labeled where a standalone chip is not the complete purchasable part. Item numbers match the first table; costs are per unit unless stated.</w:t>
+        <w:t>The Bluetooth module replaces the ESP32. Prices are per unit unless stated. Rows 12 and 12A are alternatives, not additive. Cellular options 8 and 17 have different calling capabilities. Modules and complete physical parts are labeled explicitly.</w:t>
       </w:r>
     </w:p>
     <w:tbl>
@@ -3604,6 +3609,135 @@
                 <w:b w:val="0"/>
                 <w:sz w:val="20"/>
               </w:rPr>
+              <w:t>8</w:t>
+            </w:r>
+          </w:p>
+        </w:tc>
+        <w:tc>
+          <w:tcPr>
+            <w:tcW w:type="dxa" w:w="1699"/>
+            <w:vAlign w:val="center"/>
+            <w:tcBorders>
+              <w:top w:val="single" w:sz="4" w:color="D9D9D9"/>
+              <w:left w:val="single" w:sz="4" w:color="D9D9D9"/>
+              <w:bottom w:val="single" w:sz="4" w:color="D9D9D9"/>
+              <w:right w:val="single" w:sz="4" w:color="D9D9D9"/>
+            </w:tcBorders>
+            <w:tcMar>
+              <w:top w:w="75" w:type="dxa"/>
+              <w:bottom w:w="75" w:type="dxa"/>
+              <w:left w:w="90" w:type="dxa"/>
+              <w:right w:w="90" w:type="dxa"/>
+            </w:tcMar>
+          </w:tcPr>
+          <w:p>
+            <w:pPr>
+              <w:spacing w:after="0" w:line="240" w:lineRule="auto"/>
+            </w:pPr>
+            <w:r>
+              <w:rPr>
+                <w:b w:val="0"/>
+                <w:sz w:val="20"/>
+              </w:rPr>
+              <w:t>Cellular data</w:t>
+            </w:r>
+          </w:p>
+        </w:tc>
+        <w:tc>
+          <w:tcPr>
+            <w:tcW w:type="dxa" w:w="6552"/>
+            <w:vAlign w:val="center"/>
+            <w:tcBorders>
+              <w:top w:val="single" w:sz="4" w:color="D9D9D9"/>
+              <w:left w:val="single" w:sz="4" w:color="D9D9D9"/>
+              <w:bottom w:val="single" w:sz="4" w:color="D9D9D9"/>
+              <w:right w:val="single" w:sz="4" w:color="D9D9D9"/>
+            </w:tcBorders>
+            <w:tcMar>
+              <w:top w:w="75" w:type="dxa"/>
+              <w:bottom w:w="75" w:type="dxa"/>
+              <w:left w:w="90" w:type="dxa"/>
+              <w:right w:w="90" w:type="dxa"/>
+            </w:tcMar>
+          </w:tcPr>
+          <w:p>
+            <w:pPr>
+              <w:spacing w:after="0" w:line="240" w:lineRule="auto"/>
+            </w:pPr>
+            <w:hyperlink r:id="rId32">
+              <w:r>
+                <w:rPr>
+                  <w:color w:val="175E78"/>
+                  <w:u w:val="single"/>
+                  <w:sz w:val="20"/>
+                </w:rPr>
+                <w:t>NRF9160-SICA-B1A-R7 SiP — data/SMS</w:t>
+              </w:r>
+            </w:hyperlink>
+          </w:p>
+        </w:tc>
+        <w:tc>
+          <w:tcPr>
+            <w:tcW w:type="dxa" w:w="1512"/>
+            <w:vAlign w:val="center"/>
+            <w:tcBorders>
+              <w:top w:val="single" w:sz="4" w:color="D9D9D9"/>
+              <w:left w:val="single" w:sz="4" w:color="D9D9D9"/>
+              <w:bottom w:val="single" w:sz="4" w:color="D9D9D9"/>
+              <w:right w:val="single" w:sz="4" w:color="D9D9D9"/>
+            </w:tcBorders>
+            <w:tcMar>
+              <w:top w:w="75" w:type="dxa"/>
+              <w:bottom w:w="75" w:type="dxa"/>
+              <w:left w:w="90" w:type="dxa"/>
+              <w:right w:w="90" w:type="dxa"/>
+            </w:tcMar>
+          </w:tcPr>
+          <w:p>
+            <w:pPr>
+              <w:spacing w:after="0" w:line="240" w:lineRule="auto"/>
+            </w:pPr>
+            <w:r>
+              <w:rPr>
+                <w:b w:val="0"/>
+                <w:sz w:val="20"/>
+              </w:rPr>
+              <w:t>$31.56</w:t>
+            </w:r>
+          </w:p>
+        </w:tc>
+      </w:tr>
+      <w:tr>
+        <w:trPr>
+          <w:cantSplit/>
+        </w:trPr>
+        <w:tc>
+          <w:tcPr>
+            <w:tcW w:type="dxa" w:w="605"/>
+            <w:vAlign w:val="center"/>
+            <w:tcBorders>
+              <w:top w:val="single" w:sz="4" w:color="D9D9D9"/>
+              <w:left w:val="single" w:sz="4" w:color="D9D9D9"/>
+              <w:bottom w:val="single" w:sz="4" w:color="D9D9D9"/>
+              <w:right w:val="single" w:sz="4" w:color="D9D9D9"/>
+            </w:tcBorders>
+            <w:tcMar>
+              <w:top w:w="75" w:type="dxa"/>
+              <w:bottom w:w="75" w:type="dxa"/>
+              <w:left w:w="90" w:type="dxa"/>
+              <w:right w:w="90" w:type="dxa"/>
+            </w:tcMar>
+          </w:tcPr>
+          <w:p>
+            <w:pPr>
+              <w:spacing w:after="0" w:line="240" w:lineRule="auto"/>
+              <w:jc w:val="center"/>
+            </w:pPr>
+            <w:r>
+              <w:rPr>
+                <w:b w:val="0"/>
+                <w:sz w:val="20"/>
+              </w:rPr>
               <w:t>10</w:t>
             </w:r>
           </w:p>
@@ -3659,7 +3793,7 @@
             <w:pPr>
               <w:spacing w:after="0" w:line="240" w:lineRule="auto"/>
             </w:pPr>
-            <w:hyperlink r:id="rId32">
+            <w:hyperlink r:id="rId33">
               <w:r>
                 <w:rPr>
                   <w:color w:val="175E78"/>
@@ -3917,7 +4051,7 @@
             <w:pPr>
               <w:spacing w:after="0" w:line="240" w:lineRule="auto"/>
             </w:pPr>
-            <w:hyperlink r:id="rId33">
+            <w:hyperlink r:id="rId34">
               <w:r>
                 <w:rPr>
                   <w:color w:val="175E78"/>
@@ -3956,6 +4090,135 @@
                 <w:sz w:val="20"/>
               </w:rPr>
               <w:t>$7.00</w:t>
+            </w:r>
+          </w:p>
+        </w:tc>
+      </w:tr>
+      <w:tr>
+        <w:trPr>
+          <w:cantSplit/>
+        </w:trPr>
+        <w:tc>
+          <w:tcPr>
+            <w:tcW w:type="dxa" w:w="605"/>
+            <w:vAlign w:val="center"/>
+            <w:tcBorders>
+              <w:top w:val="single" w:sz="4" w:color="D9D9D9"/>
+              <w:left w:val="single" w:sz="4" w:color="D9D9D9"/>
+              <w:bottom w:val="single" w:sz="4" w:color="D9D9D9"/>
+              <w:right w:val="single" w:sz="4" w:color="D9D9D9"/>
+            </w:tcBorders>
+            <w:tcMar>
+              <w:top w:w="75" w:type="dxa"/>
+              <w:bottom w:w="75" w:type="dxa"/>
+              <w:left w:w="90" w:type="dxa"/>
+              <w:right w:w="90" w:type="dxa"/>
+            </w:tcMar>
+          </w:tcPr>
+          <w:p>
+            <w:pPr>
+              <w:spacing w:after="0" w:line="240" w:lineRule="auto"/>
+              <w:jc w:val="center"/>
+            </w:pPr>
+            <w:r>
+              <w:rPr>
+                <w:b w:val="0"/>
+                <w:sz w:val="20"/>
+              </w:rPr>
+              <w:t>12A</w:t>
+            </w:r>
+          </w:p>
+        </w:tc>
+        <w:tc>
+          <w:tcPr>
+            <w:tcW w:type="dxa" w:w="1699"/>
+            <w:vAlign w:val="center"/>
+            <w:tcBorders>
+              <w:top w:val="single" w:sz="4" w:color="D9D9D9"/>
+              <w:left w:val="single" w:sz="4" w:color="D9D9D9"/>
+              <w:bottom w:val="single" w:sz="4" w:color="D9D9D9"/>
+              <w:right w:val="single" w:sz="4" w:color="D9D9D9"/>
+            </w:tcBorders>
+            <w:tcMar>
+              <w:top w:w="75" w:type="dxa"/>
+              <w:bottom w:w="75" w:type="dxa"/>
+              <w:left w:w="90" w:type="dxa"/>
+              <w:right w:w="90" w:type="dxa"/>
+            </w:tcMar>
+          </w:tcPr>
+          <w:p>
+            <w:pPr>
+              <w:spacing w:after="0" w:line="240" w:lineRule="auto"/>
+            </w:pPr>
+            <w:r>
+              <w:rPr>
+                <w:b w:val="0"/>
+                <w:sz w:val="20"/>
+              </w:rPr>
+              <w:t>Bare alternative</w:t>
+            </w:r>
+          </w:p>
+        </w:tc>
+        <w:tc>
+          <w:tcPr>
+            <w:tcW w:type="dxa" w:w="6552"/>
+            <w:vAlign w:val="center"/>
+            <w:tcBorders>
+              <w:top w:val="single" w:sz="4" w:color="D9D9D9"/>
+              <w:left w:val="single" w:sz="4" w:color="D9D9D9"/>
+              <w:bottom w:val="single" w:sz="4" w:color="D9D9D9"/>
+              <w:right w:val="single" w:sz="4" w:color="D9D9D9"/>
+            </w:tcBorders>
+            <w:tcMar>
+              <w:top w:w="75" w:type="dxa"/>
+              <w:bottom w:w="75" w:type="dxa"/>
+              <w:left w:w="90" w:type="dxa"/>
+              <w:right w:w="90" w:type="dxa"/>
+            </w:tcMar>
+          </w:tcPr>
+          <w:p>
+            <w:pPr>
+              <w:spacing w:after="0" w:line="240" w:lineRule="auto"/>
+            </w:pPr>
+            <w:hyperlink r:id="rId35">
+              <w:r>
+                <w:rPr>
+                  <w:color w:val="175E78"/>
+                  <w:u w:val="single"/>
+                  <w:sz w:val="20"/>
+                </w:rPr>
+                <w:t>Nordic NRF5340-CLAA-R SoC</w:t>
+              </w:r>
+            </w:hyperlink>
+          </w:p>
+        </w:tc>
+        <w:tc>
+          <w:tcPr>
+            <w:tcW w:type="dxa" w:w="1512"/>
+            <w:vAlign w:val="center"/>
+            <w:tcBorders>
+              <w:top w:val="single" w:sz="4" w:color="D9D9D9"/>
+              <w:left w:val="single" w:sz="4" w:color="D9D9D9"/>
+              <w:bottom w:val="single" w:sz="4" w:color="D9D9D9"/>
+              <w:right w:val="single" w:sz="4" w:color="D9D9D9"/>
+            </w:tcBorders>
+            <w:tcMar>
+              <w:top w:w="75" w:type="dxa"/>
+              <w:bottom w:w="75" w:type="dxa"/>
+              <w:left w:w="90" w:type="dxa"/>
+              <w:right w:w="90" w:type="dxa"/>
+            </w:tcMar>
+          </w:tcPr>
+          <w:p>
+            <w:pPr>
+              <w:spacing w:after="0" w:line="240" w:lineRule="auto"/>
+            </w:pPr>
+            <w:r>
+              <w:rPr>
+                <w:b w:val="0"/>
+                <w:sz w:val="20"/>
+              </w:rPr>
+              <w:t>$8.65</w:t>
             </w:r>
           </w:p>
         </w:tc>
@@ -4046,7 +4309,7 @@
             <w:pPr>
               <w:spacing w:after="0" w:line="240" w:lineRule="auto"/>
             </w:pPr>
-            <w:hyperlink r:id="rId34">
+            <w:hyperlink r:id="rId36">
               <w:r>
                 <w:rPr>
                   <w:color w:val="175E78"/>
@@ -4175,7 +4438,7 @@
             <w:pPr>
               <w:spacing w:after="0" w:line="240" w:lineRule="auto"/>
             </w:pPr>
-            <w:hyperlink r:id="rId35">
+            <w:hyperlink r:id="rId37">
               <w:r>
                 <w:rPr>
                   <w:color w:val="175E78"/>
@@ -4433,7 +4696,7 @@
             <w:pPr>
               <w:spacing w:after="0" w:line="240" w:lineRule="auto"/>
             </w:pPr>
-            <w:hyperlink r:id="rId36">
+            <w:hyperlink r:id="rId38">
               <w:r>
                 <w:rPr>
                   <w:color w:val="175E78"/>
@@ -4537,7 +4800,7 @@
                 <w:b w:val="0"/>
                 <w:sz w:val="20"/>
               </w:rPr>
-              <w:t>Calls and texts</w:t>
+              <w:t>Standalone calls</w:t>
             </w:r>
           </w:p>
         </w:tc>
@@ -4562,14 +4825,14 @@
             <w:pPr>
               <w:spacing w:after="0" w:line="240" w:lineRule="auto"/>
             </w:pPr>
-            <w:hyperlink r:id="rId37">
+            <w:hyperlink r:id="rId39">
               <w:r>
                 <w:rPr>
                   <w:color w:val="175E78"/>
                   <w:u w:val="single"/>
                   <w:sz w:val="20"/>
                 </w:rPr>
-                <w:t>SIMCom SIM7600NA-H modem module</w:t>
+                <w:t>SIMCom SIM7600NA-H VoLTE/SMS module</w:t>
               </w:r>
             </w:hyperlink>
           </w:p>
@@ -4691,7 +4954,7 @@
             <w:pPr>
               <w:spacing w:after="0" w:line="240" w:lineRule="auto"/>
             </w:pPr>
-            <w:hyperlink r:id="rId38">
+            <w:hyperlink r:id="rId40">
               <w:r>
                 <w:rPr>
                   <w:color w:val="175E78"/>
@@ -4820,7 +5083,7 @@
             <w:pPr>
               <w:spacing w:after="0" w:line="240" w:lineRule="auto"/>
             </w:pPr>
-            <w:hyperlink r:id="rId39">
+            <w:hyperlink r:id="rId41">
               <w:r>
                 <w:rPr>
                   <w:color w:val="175E78"/>
@@ -4874,17 +5137,17 @@
         <w:rPr>
           <w:b/>
         </w:rPr>
-        <w:t>Bluetooth:</w:t>
+        <w:t>Nordic options:</w:t>
       </w:r>
       <w:r>
-        <w:t xml:space="preserve"> the $7 module is a candidate with an onboard antenna, costing $210 for 30 before the listing’s $25 shipping charge. It supports BLE, not Classic Bluetooth/A2DP. Items 8 and 9 are prototype test boards and are excluded here; item 17 is the separate voice/SMS modem candidate.</w:t>
+        <w:t xml:space="preserve"> the $7 Bluetooth module already contains an nRF5340. Its bare-SoC alternative costs $8.65 at quantity one, or $7.1024 each at 30 ($213.07), plus RF/support circuitry. The module costs $210 for 30 plus $25 listed shipping. ESP32 remains testing-only.</w:t>
       </w:r>
     </w:p>
     <w:p>
       <w:r>
         <w:t xml:space="preserve">PCB: $240 is a planning allowance for 30 bare 0.8 mm boards, excluding components, soldering/assembly, shipping, and tax. For comparison, </w:t>
       </w:r>
-      <w:hyperlink r:id="rId40">
+      <w:hyperlink r:id="rId42">
         <w:r>
           <w:rPr>
             <w:color w:val="175E78"/>
@@ -4899,13 +5162,19 @@
     </w:p>
     <w:p>
       <w:r>
-        <w:rPr>
-          <w:b/>
-        </w:rPr>
-        <w:t>Integration:</w:t>
+        <w:t xml:space="preserve">Cellular and payments: nRF9160 supports data and carrier-dependent SMS, but </w:t>
       </w:r>
+      <w:hyperlink r:id="rId43">
+        <w:r>
+          <w:rPr>
+            <w:color w:val="175E78"/>
+            <w:u w:val="single"/>
+          </w:rPr>
+          <w:t>does not support VoLTE calls</w:t>
+        </w:r>
+      </w:hyperlink>
       <w:r>
-        <w:t xml:space="preserve"> the original microphone chip is obsolete; the TDK part needs electrical/acoustic validation. The camera assembly uses parallel DVP rather than SPI. Cellular calls/texts need carrier-approved VoLTE and a voice/SMS plan. Payment hardware needs credential provisioning and supported cards. Solar requires a charge-current and energy-budget check. These are component prices, not a complete assembled-device total.</w:t>
+        <w:t>. SIM7600 is a separate calling-modem candidate, subject to carrier approval. The £99 payment pack is for evaluation; production payment-chip pricing remains quote-required. No minimum payment-chip cost is established by that pack.</w:t>
       </w:r>
     </w:p>
     <w:sectPr>

</xml_diff>

<commit_message>
Research lower-cost calling hardware and correct cost benchmarks
</commit_message>
<xml_diff>
--- a/outputs/01a0d046-7d49-7871-8a87-73ebb2cf093f/Agentic_AI_UW_Component_Costs.docx
+++ b/outputs/01a0d046-7d49-7871-8a87-73ebb2cf093f/Agentic_AI_UW_Component_Costs.docx
@@ -2329,7 +2329,7 @@
                   <w:u w:val="single"/>
                   <w:sz w:val="20"/>
                 </w:rPr>
-                <w:t>Waveshare SIM7600NA-H 4G HAT</w:t>
+                <w:t>SIMCom A7672G-LABE-TEKIT — backorder</w:t>
               </w:r>
             </w:hyperlink>
           </w:p>
@@ -2360,7 +2360,7 @@
                 <w:b w:val="0"/>
                 <w:sz w:val="20"/>
               </w:rPr>
-              <w:t>$84.99</w:t>
+              <w:t>$52.81</w:t>
             </w:r>
           </w:p>
         </w:tc>
@@ -2426,7 +2426,7 @@
                 <w:b w:val="0"/>
                 <w:sz w:val="20"/>
               </w:rPr>
-              <w:t>Payments</w:t>
+              <w:t>Payment demo</w:t>
             </w:r>
           </w:p>
         </w:tc>
@@ -2458,7 +2458,7 @@
                   <w:u w:val="single"/>
                   <w:sz w:val="20"/>
                 </w:rPr>
-                <w:t>USC wearable payment samples pack</w:t>
+                <w:t>USC evaluation pack — optional samples</w:t>
               </w:r>
             </w:hyperlink>
           </w:p>
@@ -2505,7 +2505,7 @@
     </w:p>
     <w:p>
       <w:r>
-        <w:t>The Bluetooth development board is for prototyping; the final table uses its compact module family. The camera, biometric, cellular, and payment entries are candidate additions requiring integration validation.</w:t>
+        <w:t>The Bluetooth board and module use the same chip family. The A7672G evaluation kit and module are both backordered. The optional payment sample pack is not required for every device and does not establish a payment-chip price.</w:t>
       </w:r>
     </w:p>
     <w:p>
@@ -4832,7 +4832,7 @@
                   <w:u w:val="single"/>
                   <w:sz w:val="20"/>
                 </w:rPr>
-                <w:t>SIMCom SIM7600NA-H VoLTE/SMS module</w:t>
+                <w:t>SIMCom A7672G VoLTE/SMS — backorder</w:t>
               </w:r>
             </w:hyperlink>
           </w:p>
@@ -4863,7 +4863,7 @@
                 <w:b w:val="0"/>
                 <w:sz w:val="20"/>
               </w:rPr>
-              <w:t>$42.71</w:t>
+              <w:t>$22.22</w:t>
             </w:r>
           </w:p>
         </w:tc>
@@ -5162,7 +5162,7 @@
     </w:p>
     <w:p>
       <w:r>
-        <w:t xml:space="preserve">Cellular and payments: nRF9160 supports data and carrier-dependent SMS, but </w:t>
+        <w:t xml:space="preserve">Cellular and payments: nRF9160 </w:t>
       </w:r>
       <w:hyperlink r:id="rId43">
         <w:r>
@@ -5174,7 +5174,19 @@
         </w:r>
       </w:hyperlink>
       <w:r>
-        <w:t>. SIM7600 is a separate calling-modem candidate, subject to carrier approval. The £99 payment pack is for evaluation; production payment-chip pricing remains quote-required. No minimum payment-chip cost is established by that pack.</w:t>
+        <w:t xml:space="preserve">. </w:t>
+      </w:r>
+      <w:hyperlink r:id="rId44">
+        <w:r>
+          <w:rPr>
+            <w:color w:val="175E78"/>
+            <w:u w:val="single"/>
+          </w:rPr>
+          <w:t>A7672G supports VoLTE</w:t>
+        </w:r>
+      </w:hyperlink>
+      <w:r>
+        <w:t xml:space="preserve"> and is listed at $18.3832 each for 30 ($551.50), but has no immediate distributor stock; US carrier approval remains unverified. The £99 pack is optional evaluation hardware, not payment silicon. Production payment-chip pricing is unverified and requires a supplier quote.</w:t>
       </w:r>
     </w:p>
     <w:sectPr>

</xml_diff>

<commit_message>
Document single-unit bare modem and payment IC prices
</commit_message>
<xml_diff>
--- a/outputs/01a0d046-7d49-7871-8a87-73ebb2cf093f/Agentic_AI_UW_Component_Costs.docx
+++ b/outputs/01a0d046-7d49-7871-8a87-73ebb2cf093f/Agentic_AI_UW_Component_Costs.docx
@@ -2505,7 +2505,7 @@
     </w:p>
     <w:p>
       <w:r>
-        <w:t>The Bluetooth board and module use the same chip family. The A7672G evaluation kit and module are both backordered. The optional payment sample pack is not required for every device and does not establish a payment-chip price.</w:t>
+        <w:t>The Bluetooth board and module use the same chip family. The A7672G evaluation kit is backordered; it is a different modem candidate from the bare Qualcomm IC below. The optional payment sample pack is not required for every device and does not establish a payment-chip price.</w:t>
       </w:r>
     </w:p>
     <w:p>
@@ -4800,7 +4800,7 @@
                 <w:b w:val="0"/>
                 <w:sz w:val="20"/>
               </w:rPr>
-              <w:t>Standalone calls</w:t>
+              <w:t>Voice modem IC</w:t>
             </w:r>
           </w:p>
         </w:tc>
@@ -4832,7 +4832,7 @@
                   <w:u w:val="single"/>
                   <w:sz w:val="20"/>
                 </w:rPr>
-                <w:t>SIMCom A7672G VoLTE/SMS — backorder</w:t>
+                <w:t>Qualcomm MDM9207 bare IC — see note</w:t>
               </w:r>
             </w:hyperlink>
           </w:p>
@@ -4863,7 +4863,7 @@
                 <w:b w:val="0"/>
                 <w:sz w:val="20"/>
               </w:rPr>
-              <w:t>$22.22</w:t>
+              <w:t>$9.20</w:t>
             </w:r>
           </w:p>
         </w:tc>
@@ -4929,7 +4929,7 @@
                 <w:b w:val="0"/>
                 <w:sz w:val="20"/>
               </w:rPr>
-              <w:t>Payments</w:t>
+              <w:t>NFC / secure IC</w:t>
             </w:r>
           </w:p>
         </w:tc>
@@ -4961,7 +4961,7 @@
                   <w:u w:val="single"/>
                   <w:sz w:val="20"/>
                 </w:rPr>
-                <w:t>Infineon SECORA Pay W chip or module</w:t>
+                <w:t>NXP SN100U / 100VB27 — repair-market IC</w:t>
               </w:r>
             </w:hyperlink>
           </w:p>
@@ -4992,7 +4992,7 @@
                 <w:b w:val="0"/>
                 <w:sz w:val="20"/>
               </w:rPr>
-              <w:t>Quote needed</w:t>
+              <w:t>$2.14</w:t>
             </w:r>
           </w:p>
         </w:tc>
@@ -5140,7 +5140,7 @@
         <w:t>Nordic options:</w:t>
       </w:r>
       <w:r>
-        <w:t xml:space="preserve"> the $7 Bluetooth module already contains an nRF5340. Its bare-SoC alternative costs $8.65 at quantity one, or $7.1024 each at 30 ($213.07), plus RF/support circuitry. The module costs $210 for 30 plus $25 listed shipping. ESP32 remains testing-only.</w:t>
+        <w:t xml:space="preserve"> the $7 Bluetooth module contains an nRF5340. Its bare-SoC alternative is $8.65 for one, plus RF/support circuitry. The $31.56 nRF9160 SiP supports data/SMS, not VoLTE calls. ESP32 remains testing-only.</w:t>
       </w:r>
     </w:p>
     <w:p>
@@ -5162,7 +5162,7 @@
     </w:p>
     <w:p>
       <w:r>
-        <w:t xml:space="preserve">Cellular and payments: nRF9160 </w:t>
+        <w:t xml:space="preserve">Bare modem: $9.20 buys one MDM9207 IC from an independent seller. </w:t>
       </w:r>
       <w:hyperlink r:id="rId43">
         <w:r>
@@ -5170,11 +5170,16 @@
             <w:color w:val="175E78"/>
             <w:u w:val="single"/>
           </w:rPr>
-          <w:t>does not support VoLTE calls</w:t>
+          <w:t>Qualcomm specifies VoLTE for MDM9207-1</w:t>
         </w:r>
       </w:hyperlink>
       <w:r>
-        <w:t xml:space="preserve">. </w:t>
+        <w:t>; the listing does not confirm that variant. RF transceiver, power IC, memory, antenna, firmware and carrier compatibility require separate validation/costing.</w:t>
+      </w:r>
+    </w:p>
+    <w:p>
+      <w:r>
+        <w:t xml:space="preserve">Payment IC: </w:t>
       </w:r>
       <w:hyperlink r:id="rId44">
         <w:r>
@@ -5182,11 +5187,11 @@
             <w:color w:val="175E78"/>
             <w:u w:val="single"/>
           </w:rPr>
-          <w:t>A7672G supports VoLTE</w:t>
+          <w:t>TechInsights identifies 100VB27 as SN100U</w:t>
         </w:r>
       </w:hyperlink>
       <w:r>
-        <w:t xml:space="preserve"> and is listed at $18.3832 each for 30 ($551.50), but has no immediate distributor stock; US carrier approval remains unverified. The £99 pack is optional evaluation hardware, not payment silicon. Production payment-chip pricing is unverified and requires a supplier quote.</w:t>
+        <w:t>, integrating NFC, a secure element and eSIM. The $2.14 repair-market listing covers one physical chip; keys, payment provisioning and custom-board usability are unverified. It is not a ready-to-pay wallet. Both bare IC prices exclude shipping/tax and are sourcing leads, not validated design selections.</w:t>
       </w:r>
     </w:p>
     <w:sectPr>

</xml_diff>

<commit_message>
Remove rejected cellular kit and payment pack from component document
</commit_message>
<xml_diff>
--- a/outputs/01a0d046-7d49-7871-8a87-73ebb2cf093f/Agentic_AI_UW_Component_Costs.docx
+++ b/outputs/01a0d046-7d49-7871-8a87-73ebb2cf093f/Agentic_AI_UW_Component_Costs.docx
@@ -12,7 +12,7 @@
     </w:p>
     <w:p>
       <w:r>
-        <w:t>UW–Madison ECE • Prices checked 23 September 2026 • USD unless marked GBP</w:t>
+        <w:t>UW–Madison ECE • Prices checked 23 September 2026 • Single-unit component prices in USD</w:t>
       </w:r>
     </w:p>
     <w:p>
@@ -2236,276 +2236,13 @@
           </w:p>
         </w:tc>
       </w:tr>
-      <w:tr>
-        <w:trPr>
-          <w:cantSplit/>
-        </w:trPr>
-        <w:tc>
-          <w:tcPr>
-            <w:tcW w:type="dxa" w:w="605"/>
-            <w:vAlign w:val="center"/>
-            <w:tcBorders>
-              <w:top w:val="single" w:sz="4" w:color="D9D9D9"/>
-              <w:left w:val="single" w:sz="4" w:color="D9D9D9"/>
-              <w:bottom w:val="single" w:sz="4" w:color="D9D9D9"/>
-              <w:right w:val="single" w:sz="4" w:color="D9D9D9"/>
-            </w:tcBorders>
-            <w:tcMar>
-              <w:top w:w="75" w:type="dxa"/>
-              <w:bottom w:w="75" w:type="dxa"/>
-              <w:left w:w="90" w:type="dxa"/>
-              <w:right w:w="90" w:type="dxa"/>
-            </w:tcMar>
-          </w:tcPr>
-          <w:p>
-            <w:pPr>
-              <w:spacing w:after="0" w:line="240" w:lineRule="auto"/>
-              <w:jc w:val="center"/>
-            </w:pPr>
-            <w:r>
-              <w:rPr>
-                <w:b w:val="0"/>
-                <w:sz w:val="20"/>
-              </w:rPr>
-              <w:t>17</w:t>
-            </w:r>
-          </w:p>
-        </w:tc>
-        <w:tc>
-          <w:tcPr>
-            <w:tcW w:type="dxa" w:w="1699"/>
-            <w:vAlign w:val="center"/>
-            <w:tcBorders>
-              <w:top w:val="single" w:sz="4" w:color="D9D9D9"/>
-              <w:left w:val="single" w:sz="4" w:color="D9D9D9"/>
-              <w:bottom w:val="single" w:sz="4" w:color="D9D9D9"/>
-              <w:right w:val="single" w:sz="4" w:color="D9D9D9"/>
-            </w:tcBorders>
-            <w:tcMar>
-              <w:top w:w="75" w:type="dxa"/>
-              <w:bottom w:w="75" w:type="dxa"/>
-              <w:left w:w="90" w:type="dxa"/>
-              <w:right w:w="90" w:type="dxa"/>
-            </w:tcMar>
-          </w:tcPr>
-          <w:p>
-            <w:pPr>
-              <w:spacing w:after="0" w:line="240" w:lineRule="auto"/>
-            </w:pPr>
-            <w:r>
-              <w:rPr>
-                <w:b w:val="0"/>
-                <w:sz w:val="20"/>
-              </w:rPr>
-              <w:t>Standalone calls</w:t>
-            </w:r>
-          </w:p>
-        </w:tc>
-        <w:tc>
-          <w:tcPr>
-            <w:tcW w:type="dxa" w:w="6552"/>
-            <w:vAlign w:val="center"/>
-            <w:tcBorders>
-              <w:top w:val="single" w:sz="4" w:color="D9D9D9"/>
-              <w:left w:val="single" w:sz="4" w:color="D9D9D9"/>
-              <w:bottom w:val="single" w:sz="4" w:color="D9D9D9"/>
-              <w:right w:val="single" w:sz="4" w:color="D9D9D9"/>
-            </w:tcBorders>
-            <w:tcMar>
-              <w:top w:w="75" w:type="dxa"/>
-              <w:bottom w:w="75" w:type="dxa"/>
-              <w:left w:w="90" w:type="dxa"/>
-              <w:right w:w="90" w:type="dxa"/>
-            </w:tcMar>
-          </w:tcPr>
-          <w:p>
-            <w:pPr>
-              <w:spacing w:after="0" w:line="240" w:lineRule="auto"/>
-            </w:pPr>
-            <w:hyperlink r:id="rId26">
-              <w:r>
-                <w:rPr>
-                  <w:color w:val="175E78"/>
-                  <w:u w:val="single"/>
-                  <w:sz w:val="20"/>
-                </w:rPr>
-                <w:t>SIMCom A7672G-LABE-TEKIT — backorder</w:t>
-              </w:r>
-            </w:hyperlink>
-          </w:p>
-        </w:tc>
-        <w:tc>
-          <w:tcPr>
-            <w:tcW w:type="dxa" w:w="1512"/>
-            <w:vAlign w:val="center"/>
-            <w:tcBorders>
-              <w:top w:val="single" w:sz="4" w:color="D9D9D9"/>
-              <w:left w:val="single" w:sz="4" w:color="D9D9D9"/>
-              <w:bottom w:val="single" w:sz="4" w:color="D9D9D9"/>
-              <w:right w:val="single" w:sz="4" w:color="D9D9D9"/>
-            </w:tcBorders>
-            <w:tcMar>
-              <w:top w:w="75" w:type="dxa"/>
-              <w:bottom w:w="75" w:type="dxa"/>
-              <w:left w:w="90" w:type="dxa"/>
-              <w:right w:w="90" w:type="dxa"/>
-            </w:tcMar>
-          </w:tcPr>
-          <w:p>
-            <w:pPr>
-              <w:spacing w:after="0" w:line="240" w:lineRule="auto"/>
-            </w:pPr>
-            <w:r>
-              <w:rPr>
-                <w:b w:val="0"/>
-                <w:sz w:val="20"/>
-              </w:rPr>
-              <w:t>$52.81</w:t>
-            </w:r>
-          </w:p>
-        </w:tc>
-      </w:tr>
-      <w:tr>
-        <w:trPr>
-          <w:cantSplit/>
-        </w:trPr>
-        <w:tc>
-          <w:tcPr>
-            <w:tcW w:type="dxa" w:w="605"/>
-            <w:vAlign w:val="center"/>
-            <w:tcBorders>
-              <w:top w:val="single" w:sz="4" w:color="D9D9D9"/>
-              <w:left w:val="single" w:sz="4" w:color="D9D9D9"/>
-              <w:bottom w:val="single" w:sz="4" w:color="D9D9D9"/>
-              <w:right w:val="single" w:sz="4" w:color="D9D9D9"/>
-            </w:tcBorders>
-            <w:tcMar>
-              <w:top w:w="75" w:type="dxa"/>
-              <w:bottom w:w="75" w:type="dxa"/>
-              <w:left w:w="90" w:type="dxa"/>
-              <w:right w:w="90" w:type="dxa"/>
-            </w:tcMar>
-          </w:tcPr>
-          <w:p>
-            <w:pPr>
-              <w:spacing w:after="0" w:line="240" w:lineRule="auto"/>
-              <w:jc w:val="center"/>
-            </w:pPr>
-            <w:r>
-              <w:rPr>
-                <w:b w:val="0"/>
-                <w:sz w:val="20"/>
-              </w:rPr>
-              <w:t>18</w:t>
-            </w:r>
-          </w:p>
-        </w:tc>
-        <w:tc>
-          <w:tcPr>
-            <w:tcW w:type="dxa" w:w="1699"/>
-            <w:vAlign w:val="center"/>
-            <w:tcBorders>
-              <w:top w:val="single" w:sz="4" w:color="D9D9D9"/>
-              <w:left w:val="single" w:sz="4" w:color="D9D9D9"/>
-              <w:bottom w:val="single" w:sz="4" w:color="D9D9D9"/>
-              <w:right w:val="single" w:sz="4" w:color="D9D9D9"/>
-            </w:tcBorders>
-            <w:tcMar>
-              <w:top w:w="75" w:type="dxa"/>
-              <w:bottom w:w="75" w:type="dxa"/>
-              <w:left w:w="90" w:type="dxa"/>
-              <w:right w:w="90" w:type="dxa"/>
-            </w:tcMar>
-          </w:tcPr>
-          <w:p>
-            <w:pPr>
-              <w:spacing w:after="0" w:line="240" w:lineRule="auto"/>
-            </w:pPr>
-            <w:r>
-              <w:rPr>
-                <w:b w:val="0"/>
-                <w:sz w:val="20"/>
-              </w:rPr>
-              <w:t>Payment demo</w:t>
-            </w:r>
-          </w:p>
-        </w:tc>
-        <w:tc>
-          <w:tcPr>
-            <w:tcW w:type="dxa" w:w="6552"/>
-            <w:vAlign w:val="center"/>
-            <w:tcBorders>
-              <w:top w:val="single" w:sz="4" w:color="D9D9D9"/>
-              <w:left w:val="single" w:sz="4" w:color="D9D9D9"/>
-              <w:bottom w:val="single" w:sz="4" w:color="D9D9D9"/>
-              <w:right w:val="single" w:sz="4" w:color="D9D9D9"/>
-            </w:tcBorders>
-            <w:tcMar>
-              <w:top w:w="75" w:type="dxa"/>
-              <w:bottom w:w="75" w:type="dxa"/>
-              <w:left w:w="90" w:type="dxa"/>
-              <w:right w:w="90" w:type="dxa"/>
-            </w:tcMar>
-          </w:tcPr>
-          <w:p>
-            <w:pPr>
-              <w:spacing w:after="0" w:line="240" w:lineRule="auto"/>
-            </w:pPr>
-            <w:hyperlink r:id="rId27">
-              <w:r>
-                <w:rPr>
-                  <w:color w:val="175E78"/>
-                  <w:u w:val="single"/>
-                  <w:sz w:val="20"/>
-                </w:rPr>
-                <w:t>USC evaluation pack — optional samples</w:t>
-              </w:r>
-            </w:hyperlink>
-          </w:p>
-        </w:tc>
-        <w:tc>
-          <w:tcPr>
-            <w:tcW w:type="dxa" w:w="1512"/>
-            <w:vAlign w:val="center"/>
-            <w:tcBorders>
-              <w:top w:val="single" w:sz="4" w:color="D9D9D9"/>
-              <w:left w:val="single" w:sz="4" w:color="D9D9D9"/>
-              <w:bottom w:val="single" w:sz="4" w:color="D9D9D9"/>
-              <w:right w:val="single" w:sz="4" w:color="D9D9D9"/>
-            </w:tcBorders>
-            <w:tcMar>
-              <w:top w:w="75" w:type="dxa"/>
-              <w:bottom w:w="75" w:type="dxa"/>
-              <w:left w:w="90" w:type="dxa"/>
-              <w:right w:w="90" w:type="dxa"/>
-            </w:tcMar>
-          </w:tcPr>
-          <w:p>
-            <w:pPr>
-              <w:spacing w:after="0" w:line="240" w:lineRule="auto"/>
-            </w:pPr>
-            <w:r>
-              <w:rPr>
-                <w:b w:val="0"/>
-                <w:sz w:val="20"/>
-              </w:rPr>
-              <w:t>£99 / pack</w:t>
-            </w:r>
-          </w:p>
-        </w:tc>
-      </w:tr>
     </w:tbl>
     <w:p>
       <w:pPr>
         <w:spacing w:before="140"/>
       </w:pPr>
       <w:r>
-        <w:t>Items 1–11 use the actual receipt prices; the remaining entries use current single-unit listings. The payment sample pack is priced in GBP excluding VAT and contains multiple samples. It is not a per-chip price. Other current prices exclude tax, shipping, and tariffs.</w:t>
-      </w:r>
-    </w:p>
-    <w:p>
-      <w:r>
-        <w:t>The Bluetooth board and module use the same chip family. The A7672G evaluation kit is backordered; it is a different modem candidate from the bare Qualcomm IC below. The optional payment sample pack is not required for every device and does not establish a payment-chip price.</w:t>
+        <w:t>Items 1–11 use the actual receipt prices; the remaining entries use current single-unit listings. Prices exclude tax, shipping, and tariffs. Cellular and payment hardware are listed as individual ICs in the final-parts table on page 2.</w:t>
       </w:r>
     </w:p>
     <w:p>
@@ -2761,7 +2498,7 @@
             <w:pPr>
               <w:spacing w:after="0" w:line="240" w:lineRule="auto"/>
             </w:pPr>
-            <w:hyperlink r:id="rId28">
+            <w:hyperlink r:id="rId26">
               <w:r>
                 <w:rPr>
                   <w:color w:val="175E78"/>
@@ -2890,7 +2627,7 @@
             <w:pPr>
               <w:spacing w:after="0" w:line="240" w:lineRule="auto"/>
             </w:pPr>
-            <w:hyperlink r:id="rId29">
+            <w:hyperlink r:id="rId27">
               <w:r>
                 <w:rPr>
                   <w:color w:val="175E78"/>
@@ -3019,7 +2756,7 @@
             <w:pPr>
               <w:spacing w:after="0" w:line="240" w:lineRule="auto"/>
             </w:pPr>
-            <w:hyperlink r:id="rId30">
+            <w:hyperlink r:id="rId28">
               <w:r>
                 <w:rPr>
                   <w:color w:val="175E78"/>
@@ -3535,7 +3272,7 @@
             <w:pPr>
               <w:spacing w:after="0" w:line="240" w:lineRule="auto"/>
             </w:pPr>
-            <w:hyperlink r:id="rId31">
+            <w:hyperlink r:id="rId29">
               <w:r>
                 <w:rPr>
                   <w:color w:val="175E78"/>
@@ -3664,7 +3401,7 @@
             <w:pPr>
               <w:spacing w:after="0" w:line="240" w:lineRule="auto"/>
             </w:pPr>
-            <w:hyperlink r:id="rId32">
+            <w:hyperlink r:id="rId30">
               <w:r>
                 <w:rPr>
                   <w:color w:val="175E78"/>
@@ -3793,7 +3530,7 @@
             <w:pPr>
               <w:spacing w:after="0" w:line="240" w:lineRule="auto"/>
             </w:pPr>
-            <w:hyperlink r:id="rId33">
+            <w:hyperlink r:id="rId31">
               <w:r>
                 <w:rPr>
                   <w:color w:val="175E78"/>
@@ -4051,7 +3788,7 @@
             <w:pPr>
               <w:spacing w:after="0" w:line="240" w:lineRule="auto"/>
             </w:pPr>
-            <w:hyperlink r:id="rId34">
+            <w:hyperlink r:id="rId32">
               <w:r>
                 <w:rPr>
                   <w:color w:val="175E78"/>
@@ -4180,7 +3917,7 @@
             <w:pPr>
               <w:spacing w:after="0" w:line="240" w:lineRule="auto"/>
             </w:pPr>
-            <w:hyperlink r:id="rId35">
+            <w:hyperlink r:id="rId33">
               <w:r>
                 <w:rPr>
                   <w:color w:val="175E78"/>
@@ -4309,7 +4046,7 @@
             <w:pPr>
               <w:spacing w:after="0" w:line="240" w:lineRule="auto"/>
             </w:pPr>
-            <w:hyperlink r:id="rId36">
+            <w:hyperlink r:id="rId34">
               <w:r>
                 <w:rPr>
                   <w:color w:val="175E78"/>
@@ -4438,7 +4175,7 @@
             <w:pPr>
               <w:spacing w:after="0" w:line="240" w:lineRule="auto"/>
             </w:pPr>
-            <w:hyperlink r:id="rId37">
+            <w:hyperlink r:id="rId35">
               <w:r>
                 <w:rPr>
                   <w:color w:val="175E78"/>
@@ -4696,7 +4433,7 @@
             <w:pPr>
               <w:spacing w:after="0" w:line="240" w:lineRule="auto"/>
             </w:pPr>
-            <w:hyperlink r:id="rId38">
+            <w:hyperlink r:id="rId36">
               <w:r>
                 <w:rPr>
                   <w:color w:val="175E78"/>
@@ -4825,7 +4562,7 @@
             <w:pPr>
               <w:spacing w:after="0" w:line="240" w:lineRule="auto"/>
             </w:pPr>
-            <w:hyperlink r:id="rId39">
+            <w:hyperlink r:id="rId37">
               <w:r>
                 <w:rPr>
                   <w:color w:val="175E78"/>
@@ -4954,7 +4691,7 @@
             <w:pPr>
               <w:spacing w:after="0" w:line="240" w:lineRule="auto"/>
             </w:pPr>
-            <w:hyperlink r:id="rId40">
+            <w:hyperlink r:id="rId38">
               <w:r>
                 <w:rPr>
                   <w:color w:val="175E78"/>
@@ -5083,7 +4820,7 @@
             <w:pPr>
               <w:spacing w:after="0" w:line="240" w:lineRule="auto"/>
             </w:pPr>
-            <w:hyperlink r:id="rId41">
+            <w:hyperlink r:id="rId39">
               <w:r>
                 <w:rPr>
                   <w:color w:val="175E78"/>
@@ -5147,7 +4884,7 @@
       <w:r>
         <w:t xml:space="preserve">PCB: $240 is a planning allowance for 30 bare 0.8 mm boards, excluding components, soldering/assembly, shipping, and tax. For comparison, </w:t>
       </w:r>
-      <w:hyperlink r:id="rId42">
+      <w:hyperlink r:id="rId40">
         <w:r>
           <w:rPr>
             <w:color w:val="175E78"/>
@@ -5164,7 +4901,7 @@
       <w:r>
         <w:t xml:space="preserve">Bare modem: $9.20 buys one MDM9207 IC from an independent seller. </w:t>
       </w:r>
-      <w:hyperlink r:id="rId43">
+      <w:hyperlink r:id="rId41">
         <w:r>
           <w:rPr>
             <w:color w:val="175E78"/>
@@ -5181,7 +4918,7 @@
       <w:r>
         <w:t xml:space="preserve">Payment IC: </w:t>
       </w:r>
-      <w:hyperlink r:id="rId44">
+      <w:hyperlink r:id="rId42">
         <w:r>
           <w:rPr>
             <w:color w:val="175E78"/>

</xml_diff>